<commit_message>
Update participant notice for workshop group review
</commit_message>
<xml_diff>
--- a/docs/Musparql_Participant_Notice_ICF_Review.docx
+++ b/docs/Musparql_Participant_Notice_ICF_Review.docx
@@ -426,6 +426,21 @@
           <w:color w:val="000000"/>
           <w:sz w:val="22"/>
         </w:rPr>
+        <w:t>For the IPL workshop, you may work alone or in a self-selected reviewing group. A group's joint submission is attributed to the pseudonymous reviewer identifiers of the people who contributed to it.</w:t>
+      </w:r>
+    </w:p>
+    <w:p>
+      <w:pPr>
+        <w:widowControl/>
+        <w:spacing w:before="0" w:after="140" w:line="276" w:lineRule="auto"/>
+      </w:pPr>
+      <w:r>
+        <w:rPr>
+          <w:rFonts w:ascii="Arial" w:hAnsi="Arial" w:eastAsia="Arial"/>
+          <w:b w:val="0"/>
+          <w:color w:val="000000"/>
+          <w:sz w:val="22"/>
+        </w:rPr>
         <w:t>We publish benchmark questions and ambiguity or alternative data, but not your name, contact details, reviewer profile, or reviewer-linked annotations.</w:t>
       </w:r>
     </w:p>
@@ -1019,7 +1034,22 @@
           <w:color w:val="000000"/>
           <w:sz w:val="22"/>
         </w:rPr>
-        <w:t>You will sign in using a short code sent to your invited email address. You will complete a short profile and, before each assignment, confirm your relevant subject expertise and familiarity with the assigned knowledge graph.</w:t>
+        <w:t>You will normally sign in using a short code sent to your invited email address. If email login is unavailable at the IPL workshop, the facilitator may instead give you a shared workshop entry code. Each use of that code creates a separate participant account and session. You will then complete a short profile and, before each assignment, confirm your relevant subject expertise and familiarity with the assigned knowledge graph.</w:t>
+      </w:r>
+    </w:p>
+    <w:p>
+      <w:pPr>
+        <w:widowControl/>
+        <w:spacing w:before="0" w:after="140" w:line="276" w:lineRule="auto"/>
+      </w:pPr>
+      <w:r>
+        <w:rPr>
+          <w:rFonts w:ascii="Arial" w:hAnsi="Arial" w:eastAsia="Arial"/>
+          <w:b w:val="0"/>
+          <w:color w:val="000000"/>
+          <w:sz w:val="22"/>
+        </w:rPr>
+        <w:t>For the IPL workshop, you may work alone or in a self-selected reviewing group. Each participant consents and completes their profile individually. A group makes one joint submission, attributed to the pseudonymous reviewer identifiers of the members who contributed to it.</w:t>
       </w:r>
     </w:p>
     <w:p>
@@ -1222,25 +1252,7 @@
           <w:color w:val="000000"/>
           <w:sz w:val="22"/>
         </w:rPr>
-        <w:t xml:space="preserve">• </w:t>
-      </w:r>
-      <w:r>
-        <w:rPr>
-          <w:rFonts w:ascii="Arial" w:hAnsi="Arial" w:eastAsia="Arial"/>
-          <w:b/>
-          <w:color w:val="000000"/>
-          <w:sz w:val="22"/>
-        </w:rPr>
-        <w:t>Operational identity and contact:</w:t>
-      </w:r>
-      <w:r>
-        <w:rPr>
-          <w:rFonts w:ascii="Arial" w:hAnsi="Arial" w:eastAsia="Arial"/>
-          <w:b w:val="0"/>
-          <w:color w:val="000000"/>
-          <w:sz w:val="22"/>
-        </w:rPr>
-        <w:t xml:space="preserve"> your name, email address, optional affiliation, account status, and the confidential link to your pseudonymous reviewer identifier. These details are used for invitations, login, follow-up questions about your annotations, and future annotation invitations; they are not research variables.</w:t>
+        <w:t>• Operational identity and contact: your name, optional affiliation, account status, and the confidential link to your pseudonymous reviewer identifier. If you use email sign-in, we also collect your email address. These details are used for invitations, login, follow-up questions about your annotations, and future annotation invitations; they are not research variables.</w:t>
       </w:r>
     </w:p>
     <w:p>
@@ -1392,25 +1404,7 @@
           <w:color w:val="000000"/>
           <w:sz w:val="22"/>
         </w:rPr>
-        <w:t xml:space="preserve">• </w:t>
-      </w:r>
-      <w:r>
-        <w:rPr>
-          <w:rFonts w:ascii="Arial" w:hAnsi="Arial" w:eastAsia="Arial"/>
-          <w:b/>
-          <w:color w:val="000000"/>
-          <w:sz w:val="22"/>
-        </w:rPr>
-        <w:t>Review contributions:</w:t>
-      </w:r>
-      <w:r>
-        <w:rPr>
-          <w:rFonts w:ascii="Arial" w:hAnsi="Arial" w:eastAsia="Arial"/>
-          <w:b w:val="0"/>
-          <w:color w:val="000000"/>
-          <w:sz w:val="22"/>
-        </w:rPr>
-        <w:t xml:space="preserve"> decisions, rewrites, alternative formulations, ratings, comments, problem reports, and submission timestamps.</w:t>
+        <w:t>• Review contributions: decisions, rewrites, alternative formulations, ratings, comments, problem reports, submission timestamps, and, for joint submissions, the reviewing group's pseudonymous identifier and the pseudonymous reviewer identifiers of its contributors.</w:t>
       </w:r>
     </w:p>
     <w:p>
@@ -1557,16 +1551,7 @@
           <w:color w:val="000000"/>
           <w:sz w:val="22"/>
         </w:rPr>
-        <w:t xml:space="preserve">• </w:t>
-      </w:r>
-      <w:r>
-        <w:rPr>
-          <w:rFonts w:ascii="Arial" w:hAnsi="Arial" w:eastAsia="Arial"/>
-          <w:b w:val="0"/>
-          <w:color w:val="000000"/>
-          <w:sz w:val="22"/>
-        </w:rPr>
-        <w:t>understand which forms of expertise and knowledge-graph familiarity are represented in the reviewer group;</w:t>
+        <w:t>• understand which forms of expertise and knowledge-graph familiarity are represented in the reviewer cohort;</w:t>
       </w:r>
     </w:p>
     <w:p>
@@ -2048,7 +2033,7 @@
           <w:color w:val="000000"/>
           <w:sz w:val="22"/>
         </w:rPr>
-        <w:t>Musparql uses invitation-only access, short-lived single-use login codes, revocable sessions, HTTPS, access controls, restricted service accounts, redacted operational logs, encrypted off-server backups, security updates, and tested recovery procedures. No online service can eliminate every risk, but ICF and the researcher take measures proportionate to the limited scale and nature of the study.</w:t>
+        <w:t>Musparql uses controlled access, short-lived single-use login codes, a time-limited and capped workshop entry code when needed, revocable sessions, HTTPS, access controls, restricted service accounts, redacted operational logs, encrypted off-server backups, security updates, and tested recovery procedures. No online service can eliminate every risk, but ICF and the researcher take measures proportionate to the limited scale and nature of the study.</w:t>
       </w:r>
     </w:p>
     <w:p>

</xml_diff>